<commit_message>
refactor(lab5): simplify program to 2 concise menu actions: noise and east mask
</commit_message>
<xml_diff>
--- a/lab5/Лабораторна робота 5 Графіка.docx
+++ b/lab5/Лабораторна робота 5 Графіка.docx
@@ -174,7 +174,7 @@
         </w:rPr>
         <w:t>Фільтрація зображення. Реалізувати алгоритми, що дозволяють здійснити фільтрацію зображення, за варіантами:</w:t>
         <w:br/>
-        <w:t>Варіант 22. Застосуванні маски схід (курсова / компасна маска виділення меж зі східного напрямку).</w:t>
+        <w:t>Варіант 22. Застосуванні маски схід.</w:t>
       </w:r>
     </w:p>
     <w:p>
@@ -188,7 +188,7 @@
           <w:b/>
           <w:sz w:val="28"/>
         </w:rPr>
-        <w:t>Вимоги до виконання:</w:t>
+        <w:t>Завдання програми:</w:t>
       </w:r>
     </w:p>
     <w:p>
@@ -202,49 +202,7 @@
           <w:b w:val="0"/>
           <w:sz w:val="28"/>
         </w:rPr>
-        <w:t>1. Виведення первинного кольорового зображення на екран.</w:t>
-      </w:r>
-    </w:p>
-    <w:p>
-      <w:pPr>
-        <w:spacing w:after="60" w:line="276" w:lineRule="auto"/>
-        <w:jc w:val="left"/>
-      </w:pPr>
-      <w:r>
-        <w:rPr>
-          <w:rFonts w:ascii="Times New Roman" w:hAnsi="Times New Roman"/>
-          <w:b w:val="0"/>
-          <w:sz w:val="28"/>
-        </w:rPr>
-        <w:t>2. Попіксельний розрахунок яскравості пікселів за формулою ITU-R BT.601.</w:t>
-      </w:r>
-    </w:p>
-    <w:p>
-      <w:pPr>
-        <w:spacing w:after="60" w:line="276" w:lineRule="auto"/>
-        <w:jc w:val="left"/>
-      </w:pPr>
-      <w:r>
-        <w:rPr>
-          <w:rFonts w:ascii="Times New Roman" w:hAnsi="Times New Roman"/>
-          <w:b w:val="0"/>
-          <w:sz w:val="28"/>
-        </w:rPr>
-        <w:t>3. Реалізація алгоритму просторової 2D-згортки за допомогою курсової маски «Схід» 3х3 (East compass mask).</w:t>
-      </w:r>
-    </w:p>
-    <w:p>
-      <w:pPr>
-        <w:spacing w:after="60" w:line="276" w:lineRule="auto"/>
-        <w:jc w:val="left"/>
-      </w:pPr>
-      <w:r>
-        <w:rPr>
-          <w:rFonts w:ascii="Times New Roman" w:hAnsi="Times New Roman"/>
-          <w:b w:val="0"/>
-          <w:sz w:val="28"/>
-        </w:rPr>
-        <w:t>4. Дослідження класичних ядер Prewitt East та Sobel East, а також варіанту з підвищенням порогу яскравості (+100) та пороговою бінаризацією меж.</w:t>
+        <w:t>1. Зашумлення зображення (моделювання штучного імпульсного шуму згідно з теоретичними відомостями практикуму).</w:t>
       </w:r>
     </w:p>
     <w:p>
@@ -258,7 +216,7 @@
           <w:b w:val="0"/>
           <w:sz w:val="28"/>
         </w:rPr>
-        <w:t>5. Формування порівняльного колажу та збереження оброблених графічних результатів.</w:t>
+        <w:t>2. Застосування курсової маски «Схід» (просторова фільтрація ядром 3х3 для виділення контурів і меж зі східного напрямку).</w:t>
       </w:r>
     </w:p>
     <w:p>
@@ -286,7 +244,7 @@
           <w:b/>
           <w:sz w:val="28"/>
         </w:rPr>
-        <w:t>1. Виведення первинного зображення та обчислення площини яскравості</w:t>
+        <w:t>1. Зашумлення зображення</w:t>
       </w:r>
     </w:p>
     <w:p>
@@ -300,7 +258,7 @@
           <w:b w:val="0"/>
           <w:sz w:val="28"/>
         </w:rPr>
-        <w:t>Хід виконання: Реалізовано зчитування вихідного файлу та розрахунок люмінансу пікселів Y = 0.299*R + 0.587*G + 0.114*B з обробкою крайових умов методом реплікації пікселів.</w:t>
+        <w:t>Хід виконання: Реалізовано алгоритм накладання штучного імпульсного шуму на базі псевдовипадкового генератора випадкових координат, описаний у методичних вказівках (стор. 69-70). Користувач задає кількість точок шуму, після чого обрані випадкові пікселі змінюють свій колір на чорний.</w:t>
       </w:r>
     </w:p>
     <w:p>
@@ -328,9 +286,11 @@
           <w:b w:val="0"/>
           <w:sz w:val="28"/>
         </w:rPr>
-        <w:t>• load_image(), display_image() (Pillow, matplotlib) — відкриття файлу, декодування пікселів та візуалізація первинного зображення на екрані.</w:t>
+        <w:t>• add_noise() — власний алгоритм попіксельного зашумлення випадковими точками.</w:t>
         <w:br/>
-        <w:t>• calculate_pixel_brightness(), get_brightness_plane() — власні алгоритми формування матриці яскравості зображення.</w:t>
+        <w:t>• load_image(), save_image() (Pillow) — зчитування та збереження графічного файлу.</w:t>
+        <w:br/>
+        <w:t>• run_add_noise() — функція координації процесу зашумлення та збереження результату в output/noisy_image.png.</w:t>
       </w:r>
     </w:p>
     <w:p>
@@ -341,7 +301,7 @@
       <w:r>
         <w:drawing>
           <wp:inline xmlns:a="http://schemas.openxmlformats.org/drawingml/2006/main" xmlns:pic="http://schemas.openxmlformats.org/drawingml/2006/picture">
-            <wp:extent cx="5669280" cy="3264131"/>
+            <wp:extent cx="5669280" cy="2920538"/>
             <wp:docPr id="1" name="Picture 1"/>
             <wp:cNvGraphicFramePr>
               <a:graphicFrameLocks noChangeAspect="1"/>
@@ -362,7 +322,7 @@
                   <pic:spPr>
                     <a:xfrm>
                       <a:off x="0" y="0"/>
-                      <a:ext cx="5669280" cy="3264131"/>
+                      <a:ext cx="5669280" cy="2920538"/>
                     </a:xfrm>
                     <a:prstGeom prst="rect"/>
                   </pic:spPr>
@@ -384,7 +344,7 @@
           <w:b/>
           <w:sz w:val="28"/>
         </w:rPr>
-        <w:t>2. Реалізація та застосування курсової маски «Схід» (Prewitt та Sobel)</w:t>
+        <w:t>2. Застосування курсової маски «Схід»</w:t>
       </w:r>
     </w:p>
     <w:p>
@@ -398,7 +358,9 @@
           <w:b w:val="0"/>
           <w:sz w:val="28"/>
         </w:rPr>
-        <w:t>Хід виконання: Розроблено математичний алгоритм просторової конволюції ядра 3х3 для виявлення перепадів інтенсивності зі східного напрямку (вертикальні контури з яскравішою східною стороною). Реалізовано рівномірне ядро Prewitt East та зважене ядро Sobel East.</w:t>
+        <w:t>Хід виконання: Реалізовано попіксельний алгоритм просторової 2D-згортки за допомогою матриці курсової маски «Схід» розміром 3х3 над площиною яскравості зображення Y = 0.299*R + 0.587*G + 0.114*B. Матриця фільтра має вигляд:</w:t>
+        <w:br/>
+        <w:t>[[-1, 0, 1], [-1, 0, 1], [-1, 0, 1]]. Алгоритм виділяє контури та вертикальні межі перепаду яскравості зі східного напрямку.</w:t>
       </w:r>
     </w:p>
     <w:p>
@@ -426,11 +388,11 @@
           <w:b w:val="0"/>
           <w:sz w:val="28"/>
         </w:rPr>
-        <w:t>• get_east_compass_kernel() — формування вагових матриць 3х3 для східного напрямку.</w:t>
+        <w:t>• calculate_pixel_brightness(), get_brightness_plane() — власні функції обчислення люмінансу та побудови матриці яскравості.</w:t>
         <w:br/>
-        <w:t>• apply_east_compass_mask() — власний попіксельний алгоритм обчислення згортки з нормалізацією діапазону [0..255].</w:t>
+        <w:t>• apply_east_compass_mask() — власний алгоритм 2D-конволюції курсовою маскою з обробкою граничних умов методом реплікації сусідів.</w:t>
         <w:br/>
-        <w:t>• run_east_mask_filtering() — виконання фільтрації та збереження файлів east_prewitt.png і east_sobel.png.</w:t>
+        <w:t>• run_east_mask() — функція фільтрації та збереження результуючого зображення в output/east_mask.png.</w:t>
       </w:r>
     </w:p>
     <w:p>
@@ -441,7 +403,7 @@
       <w:r>
         <w:drawing>
           <wp:inline xmlns:a="http://schemas.openxmlformats.org/drawingml/2006/main" xmlns:pic="http://schemas.openxmlformats.org/drawingml/2006/picture">
-            <wp:extent cx="5669280" cy="3493193"/>
+            <wp:extent cx="5669280" cy="2691476"/>
             <wp:docPr id="2" name="Picture 2"/>
             <wp:cNvGraphicFramePr>
               <a:graphicFrameLocks noChangeAspect="1"/>
@@ -462,7 +424,7 @@
                   <pic:spPr>
                     <a:xfrm>
                       <a:off x="0" y="0"/>
-                      <a:ext cx="5669280" cy="3493193"/>
+                      <a:ext cx="5669280" cy="2691476"/>
                     </a:xfrm>
                     <a:prstGeom prst="rect"/>
                   </pic:spPr>
@@ -484,51 +446,7 @@
           <w:b/>
           <w:sz w:val="28"/>
         </w:rPr>
-        <w:t>3. Підвищення порогу яскравості (+100) та порівняльний аналіз</w:t>
-      </w:r>
-    </w:p>
-    <w:p>
-      <w:pPr>
-        <w:spacing w:after="80" w:line="276" w:lineRule="auto"/>
-        <w:jc w:val="left"/>
-      </w:pPr>
-      <w:r>
-        <w:rPr>
-          <w:rFonts w:ascii="Times New Roman" w:hAnsi="Times New Roman"/>
-          <w:b w:val="0"/>
-          <w:sz w:val="28"/>
-        </w:rPr>
-        <w:t>Хід виконання: Згідно з рекомендаціями методичних вказівок для забезпечення спостережливості реалізовано режим зсуву порогу яскравості додаванням константи (+100), що зберігає базовий контекст сцени, а також сформовано підсумковий порівняльний колаж.</w:t>
-      </w:r>
-    </w:p>
-    <w:p>
-      <w:pPr>
-        <w:spacing w:after="40" w:line="276" w:lineRule="auto"/>
-        <w:jc w:val="left"/>
-      </w:pPr>
-      <w:r>
-        <w:rPr>
-          <w:rFonts w:ascii="Times New Roman" w:hAnsi="Times New Roman"/>
-          <w:b/>
-          <w:sz w:val="28"/>
-        </w:rPr>
-        <w:t>Використані функції:</w:t>
-      </w:r>
-    </w:p>
-    <w:p>
-      <w:pPr>
-        <w:spacing w:after="120" w:line="276" w:lineRule="auto"/>
-        <w:jc w:val="left"/>
-      </w:pPr>
-      <w:r>
-        <w:rPr>
-          <w:rFonts w:ascii="Times New Roman" w:hAnsi="Times New Roman"/>
-          <w:b w:val="0"/>
-          <w:sz w:val="28"/>
-        </w:rPr>
-        <w:t>• apply_east_compass_mask(..., offset=100) — алгоритм згортки з підвищенням базової яскравості.</w:t>
-        <w:br/>
-        <w:t>• compare_filtering_results() — автоматична побудова матриці 2х2 для візуального порівняння оригінального та оброблених зображень.</w:t>
+        <w:t>3. Порівняння результатів обробки</w:t>
       </w:r>
     </w:p>
     <w:p>
@@ -539,7 +457,7 @@
       <w:r>
         <w:drawing>
           <wp:inline xmlns:a="http://schemas.openxmlformats.org/drawingml/2006/main" xmlns:pic="http://schemas.openxmlformats.org/drawingml/2006/picture">
-            <wp:extent cx="5669280" cy="3851740"/>
+            <wp:extent cx="5669280" cy="1445905"/>
             <wp:docPr id="3" name="Picture 3"/>
             <wp:cNvGraphicFramePr>
               <a:graphicFrameLocks noChangeAspect="1"/>
@@ -548,7 +466,7 @@
               <a:graphicData uri="http://schemas.openxmlformats.org/drawingml/2006/picture">
                 <pic:pic>
                   <pic:nvPicPr>
-                    <pic:cNvPr id="0" name="lab5_image3.png"/>
+                    <pic:cNvPr id="0" name="result_comparison.png"/>
                     <pic:cNvPicPr/>
                   </pic:nvPicPr>
                   <pic:blipFill>
@@ -560,61 +478,7 @@
                   <pic:spPr>
                     <a:xfrm>
                       <a:off x="0" y="0"/>
-                      <a:ext cx="5669280" cy="3851740"/>
-                    </a:xfrm>
-                    <a:prstGeom prst="rect"/>
-                  </pic:spPr>
-                </pic:pic>
-              </a:graphicData>
-            </a:graphic>
-          </wp:inline>
-        </w:drawing>
-      </w:r>
-    </w:p>
-    <w:p>
-      <w:pPr>
-        <w:spacing w:after="80" w:line="276" w:lineRule="auto"/>
-        <w:jc w:val="left"/>
-      </w:pPr>
-      <w:r>
-        <w:rPr>
-          <w:rFonts w:ascii="Times New Roman" w:hAnsi="Times New Roman"/>
-          <w:b/>
-          <w:sz w:val="28"/>
-        </w:rPr>
-        <w:t>4. Результати фільтрації курсовою маскою «Схід»</w:t>
-      </w:r>
-    </w:p>
-    <w:p>
-      <w:pPr>
-        <w:spacing w:after="240"/>
-        <w:jc w:val="center"/>
-      </w:pPr>
-      <w:r>
-        <w:drawing>
-          <wp:inline xmlns:a="http://schemas.openxmlformats.org/drawingml/2006/main" xmlns:pic="http://schemas.openxmlformats.org/drawingml/2006/picture">
-            <wp:extent cx="5669280" cy="4535424"/>
-            <wp:docPr id="4" name="Picture 4"/>
-            <wp:cNvGraphicFramePr>
-              <a:graphicFrameLocks noChangeAspect="1"/>
-            </wp:cNvGraphicFramePr>
-            <a:graphic>
-              <a:graphicData uri="http://schemas.openxmlformats.org/drawingml/2006/picture">
-                <pic:pic>
-                  <pic:nvPicPr>
-                    <pic:cNvPr id="0" name="comparison_east_masks.png"/>
-                    <pic:cNvPicPr/>
-                  </pic:nvPicPr>
-                  <pic:blipFill>
-                    <a:blip r:embed="rId12"/>
-                    <a:stretch>
-                      <a:fillRect/>
-                    </a:stretch>
-                  </pic:blipFill>
-                  <pic:spPr>
-                    <a:xfrm>
-                      <a:off x="0" y="0"/>
-                      <a:ext cx="5669280" cy="4535424"/>
+                      <a:ext cx="5669280" cy="1445905"/>
                     </a:xfrm>
                     <a:prstGeom prst="rect"/>
                   </pic:spPr>
@@ -636,7 +500,7 @@
           <w:b/>
           <w:sz w:val="28"/>
         </w:rPr>
-        <w:t>5. Лістинг програми з коментарями: https://github.com/max93139/Computer-Graphics_Labs_Maksym_Syvoplias</w:t>
+        <w:t>4. Лістинг програми з коментарями: https://github.com/max93139/Computer-Graphics_Labs_Maksym_Syvoplias</w:t>
       </w:r>
     </w:p>
     <w:p>
@@ -664,7 +528,7 @@
           <w:b w:val="0"/>
           <w:sz w:val="28"/>
         </w:rPr>
-        <w:t>У ході виконання лабораторної роботи №5 було досліджено методи просторової фільтрації зображень та реалізовано алгоритм курсової (компасної) маски «Схід» (Варіант 22). Встановлено, що компасні маски дозволяють виділяти межі та контури об'єктів, орієнтовані у визначеному напрямку простору, шляхом обчислення спрямованої похідної. Ядро «Схід» ефективно виділяє вертикальні границі перепаду яскравості. Досліджено модифікації ядра (Prewitt та Sobel) та продемонстровано вплив зсуву яскравості (+100) для підвищення спостережливості оброблених зображень. Усі алгоритми реалізовано на рівні попіксельної обробки буфера пам'яті без сторонніх графічних фільтрів.</w:t>
+        <w:t>У ході виконання лабораторної роботи №5 було досліджено алгоритми фільтрації растрових зображень та програмно реалізовано процедуру моделювання імпульсного шуму (зашумлення випадковими точками) і просторову фільтрацію за допомогою курсової маски «Схід» (Варіант 22). Встановлено, що курсова маска схід діє як спрямований детектор контурів, виділяючи вертикальні межі зміни яскравості. Усі алгоритми реалізовано на рівні попіксельної обробки буфера пам'яті без сторонніх графічних фільтрів.</w:t>
       </w:r>
     </w:p>
     <w:sectPr>

</xml_diff>